<commit_message>
V1.2.0 - vCISO template ready to go
</commit_message>
<xml_diff>
--- a/planet_it_vciso_template.docx
+++ b/planet_it_vciso_template.docx
@@ -2,9 +2,70 @@
 <file path=word/document.xml><?xml version="1.0" encoding="utf-8"?>
 <w:document xmlns:wpc="http://schemas.microsoft.com/office/word/2010/wordprocessingCanvas" xmlns:cx="http://schemas.microsoft.com/office/drawing/2014/chartex" xmlns:cx1="http://schemas.microsoft.com/office/drawing/2015/9/8/chartex" xmlns:cx2="http://schemas.microsoft.com/office/drawing/2015/10/21/chartex" xmlns:cx3="http://schemas.microsoft.com/office/drawing/2016/5/9/chartex" xmlns:cx4="http://schemas.microsoft.com/office/drawing/2016/5/10/chartex" xmlns:cx5="http://schemas.microsoft.com/office/drawing/2016/5/11/chartex" xmlns:cx6="http://schemas.microsoft.com/office/drawing/2016/5/12/chartex" xmlns:cx7="http://schemas.microsoft.com/office/drawing/2016/5/13/chartex" xmlns:cx8="http://schemas.microsoft.com/office/drawing/2016/5/14/chartex" xmlns:mc="http://schemas.openxmlformats.org/markup-compatibility/2006" xmlns:m="http://schemas.openxmlformats.org/officeDocument/2006/math" xmlns:aink="http://schemas.microsoft.com/office/drawing/2016/ink" xmlns:am3d="http://schemas.microsoft.com/office/drawing/2017/model3d" xmlns:oel="http://schemas.microsoft.com/office/2019/extlst" xmlns:r="http://schemas.openxmlformats.org/officeDocument/2006/relationships" xmlns:wp14="http://schemas.microsoft.com/office/word/2010/wordprocessingDrawing" xmlns:wp="http://schemas.openxmlformats.org/drawingml/2006/wordprocessingDrawing" xmlns:wpg="http://schemas.microsoft.com/office/word/2010/wordprocessingGroup" xmlns:wpi="http://schemas.microsoft.com/office/word/2010/wordprocessingInk" xmlns:wps="http://schemas.microsoft.com/office/word/2010/wordprocessingShape" xmlns:o="urn:schemas-microsoft-com:office:office" xmlns:v="urn:schemas-microsoft-com:vml" xmlns:w10="urn:schemas-microsoft-com:office:word" xmlns:w="http://schemas.openxmlformats.org/wordprocessingml/2006/main" xmlns:w14="http://schemas.microsoft.com/office/word/2010/wordml" xmlns:w15="http://schemas.microsoft.com/office/word/2012/wordml" xmlns:w16cex="http://schemas.microsoft.com/office/word/2018/wordml/cex" xmlns:w16cid="http://schemas.microsoft.com/office/word/2016/wordml/cid" xmlns:w16="http://schemas.microsoft.com/office/word/2018/wordml" xmlns:w16sdtdh="http://schemas.microsoft.com/office/word/2020/wordml/sdtdatahash" xmlns:w16sdtfl="http://schemas.microsoft.com/office/word/2024/wordml/sdtformatlock" xmlns:w16se="http://schemas.microsoft.com/office/word/2015/wordml/symex" xmlns:w16du="http://schemas.microsoft.com/office/word/2023/wordml/word16du" xmlns:wne="http://schemas.microsoft.com/office/word/2006/wordml" mc:Ignorable="w14 w15 w16se w16cid w16 w16cex w16sdtdh w16sdtfl w16du wp14">
   <w:body>
-    <w:bookmarkStart w:id="0" w:name="_Toc530485983"/>
-    <w:bookmarkStart w:id="1" w:name="_Toc530486035"/>
     <w:p>
+      <w:bookmarkStart w:id="0" w:name="_Toc530485983"/>
+      <w:bookmarkStart w:id="1" w:name="_Toc530486035"/>
+      <w:r>
+        <w:rPr>
+          <w:bCs/>
+          <w:noProof/>
+        </w:rPr>
+        <w:drawing>
+          <wp:anchor distT="0" distB="0" distL="114300" distR="114300" simplePos="0" relativeHeight="251657218" behindDoc="0" locked="0" layoutInCell="1" allowOverlap="1" wp14:anchorId="52E05962" wp14:editId="1F7E8E59">
+            <wp:simplePos x="0" y="0"/>
+            <wp:positionH relativeFrom="column">
+              <wp:posOffset>-99695</wp:posOffset>
+            </wp:positionH>
+            <wp:positionV relativeFrom="paragraph">
+              <wp:posOffset>-234315</wp:posOffset>
+            </wp:positionV>
+            <wp:extent cx="4363720" cy="532765"/>
+            <wp:effectExtent l="0" t="0" r="5080" b="635"/>
+            <wp:wrapNone/>
+            <wp:docPr id="9" name="Picture 9"/>
+            <wp:cNvGraphicFramePr>
+              <a:graphicFrameLocks xmlns:a="http://schemas.openxmlformats.org/drawingml/2006/main" noChangeAspect="1"/>
+            </wp:cNvGraphicFramePr>
+            <a:graphic xmlns:a="http://schemas.openxmlformats.org/drawingml/2006/main">
+              <a:graphicData uri="http://schemas.openxmlformats.org/drawingml/2006/picture">
+                <pic:pic xmlns:pic="http://schemas.openxmlformats.org/drawingml/2006/picture">
+                  <pic:nvPicPr>
+                    <pic:cNvPr id="9" name="Picture 9"/>
+                    <pic:cNvPicPr/>
+                  </pic:nvPicPr>
+                  <pic:blipFill>
+                    <a:blip r:embed="rId11">
+                      <a:extLst>
+                        <a:ext uri="{28A0092B-C50C-407E-A947-70E740481C1C}">
+                          <a14:useLocalDpi xmlns:a14="http://schemas.microsoft.com/office/drawing/2010/main" val="0"/>
+                        </a:ext>
+                      </a:extLst>
+                    </a:blip>
+                    <a:stretch>
+                      <a:fillRect/>
+                    </a:stretch>
+                  </pic:blipFill>
+                  <pic:spPr>
+                    <a:xfrm>
+                      <a:off x="0" y="0"/>
+                      <a:ext cx="4363720" cy="532765"/>
+                    </a:xfrm>
+                    <a:prstGeom prst="rect">
+                      <a:avLst/>
+                    </a:prstGeom>
+                  </pic:spPr>
+                </pic:pic>
+              </a:graphicData>
+            </a:graphic>
+            <wp14:sizeRelH relativeFrom="page">
+              <wp14:pctWidth>0</wp14:pctWidth>
+            </wp14:sizeRelH>
+            <wp14:sizeRelV relativeFrom="page">
+              <wp14:pctHeight>0</wp14:pctHeight>
+            </wp14:sizeRelV>
+          </wp:anchor>
+        </w:drawing>
+      </w:r>
       <w:r>
         <w:rPr>
           <w:bCs/>
@@ -13,7 +74,7 @@
         <mc:AlternateContent>
           <mc:Choice Requires="wps">
             <w:drawing>
-              <wp:anchor distT="0" distB="0" distL="114300" distR="114300" simplePos="0" relativeHeight="251657217" behindDoc="0" locked="0" layoutInCell="1" allowOverlap="1" wp14:anchorId="315D2796" wp14:editId="350DEDD9">
+              <wp:anchor distT="0" distB="0" distL="114300" distR="114300" simplePos="0" relativeHeight="251657217" behindDoc="0" locked="0" layoutInCell="1" allowOverlap="1" wp14:anchorId="315D2796" wp14:editId="1CB24A56">
                 <wp:simplePos x="0" y="0"/>
                 <wp:positionH relativeFrom="page">
                   <wp:posOffset>-53431</wp:posOffset>
@@ -115,67 +176,6 @@
           <w:noProof/>
         </w:rPr>
         <w:drawing>
-          <wp:anchor distT="0" distB="0" distL="114300" distR="114300" simplePos="0" relativeHeight="251657218" behindDoc="0" locked="0" layoutInCell="1" allowOverlap="1" wp14:anchorId="52E05962" wp14:editId="726A62C3">
-            <wp:simplePos x="0" y="0"/>
-            <wp:positionH relativeFrom="column">
-              <wp:posOffset>-95885</wp:posOffset>
-            </wp:positionH>
-            <wp:positionV relativeFrom="paragraph">
-              <wp:posOffset>-312601</wp:posOffset>
-            </wp:positionV>
-            <wp:extent cx="4363720" cy="685800"/>
-            <wp:effectExtent l="0" t="0" r="5080" b="0"/>
-            <wp:wrapNone/>
-            <wp:docPr id="9" name="Picture 9"/>
-            <wp:cNvGraphicFramePr>
-              <a:graphicFrameLocks xmlns:a="http://schemas.openxmlformats.org/drawingml/2006/main" noChangeAspect="1"/>
-            </wp:cNvGraphicFramePr>
-            <a:graphic xmlns:a="http://schemas.openxmlformats.org/drawingml/2006/main">
-              <a:graphicData uri="http://schemas.openxmlformats.org/drawingml/2006/picture">
-                <pic:pic xmlns:pic="http://schemas.openxmlformats.org/drawingml/2006/picture">
-                  <pic:nvPicPr>
-                    <pic:cNvPr id="9" name="Picture 9"/>
-                    <pic:cNvPicPr/>
-                  </pic:nvPicPr>
-                  <pic:blipFill>
-                    <a:blip r:embed="rId11">
-                      <a:extLst>
-                        <a:ext uri="{28A0092B-C50C-407E-A947-70E740481C1C}">
-                          <a14:useLocalDpi xmlns:a14="http://schemas.microsoft.com/office/drawing/2010/main"/>
-                        </a:ext>
-                      </a:extLst>
-                    </a:blip>
-                    <a:stretch>
-                      <a:fillRect/>
-                    </a:stretch>
-                  </pic:blipFill>
-                  <pic:spPr>
-                    <a:xfrm>
-                      <a:off x="0" y="0"/>
-                      <a:ext cx="4363720" cy="685800"/>
-                    </a:xfrm>
-                    <a:prstGeom prst="rect">
-                      <a:avLst/>
-                    </a:prstGeom>
-                  </pic:spPr>
-                </pic:pic>
-              </a:graphicData>
-            </a:graphic>
-            <wp14:sizeRelH relativeFrom="page">
-              <wp14:pctWidth>0</wp14:pctWidth>
-            </wp14:sizeRelH>
-            <wp14:sizeRelV relativeFrom="page">
-              <wp14:pctHeight>0</wp14:pctHeight>
-            </wp14:sizeRelV>
-          </wp:anchor>
-        </w:drawing>
-      </w:r>
-      <w:r>
-        <w:rPr>
-          <w:bCs/>
-          <w:noProof/>
-        </w:rPr>
-        <w:drawing>
           <wp:anchor distT="0" distB="0" distL="114300" distR="114300" simplePos="0" relativeHeight="251657216" behindDoc="0" locked="0" layoutInCell="1" allowOverlap="1" wp14:anchorId="4F2D5C5B" wp14:editId="3335E138">
             <wp:simplePos x="0" y="0"/>
             <wp:positionH relativeFrom="column">
@@ -272,9 +272,385 @@
           <w:noProof/>
         </w:rPr>
         <mc:AlternateContent>
+          <mc:Choice Requires="wpg">
+            <w:drawing>
+              <wp:anchor distT="0" distB="0" distL="114300" distR="114300" simplePos="0" relativeHeight="251665426" behindDoc="0" locked="0" layoutInCell="1" allowOverlap="1" wp14:anchorId="22C5FDD6" wp14:editId="0C0034BE">
+                <wp:simplePos x="0" y="0"/>
+                <wp:positionH relativeFrom="column">
+                  <wp:posOffset>-660437</wp:posOffset>
+                </wp:positionH>
+                <wp:positionV relativeFrom="paragraph">
+                  <wp:posOffset>7277861</wp:posOffset>
+                </wp:positionV>
+                <wp:extent cx="7049389" cy="1580234"/>
+                <wp:effectExtent l="0" t="0" r="0" b="0"/>
+                <wp:wrapNone/>
+                <wp:docPr id="1744176636" name="Group 12"/>
+                <wp:cNvGraphicFramePr/>
+                <a:graphic xmlns:a="http://schemas.openxmlformats.org/drawingml/2006/main">
+                  <a:graphicData uri="http://schemas.microsoft.com/office/word/2010/wordprocessingGroup">
+                    <wpg:wgp>
+                      <wpg:cNvGrpSpPr/>
+                      <wpg:grpSpPr>
+                        <a:xfrm>
+                          <a:off x="0" y="0"/>
+                          <a:ext cx="7049389" cy="1580234"/>
+                          <a:chOff x="0" y="0"/>
+                          <a:chExt cx="9642454" cy="2162123"/>
+                        </a:xfrm>
+                      </wpg:grpSpPr>
+                      <pic:pic xmlns:pic="http://schemas.openxmlformats.org/drawingml/2006/picture">
+                        <pic:nvPicPr>
+                          <pic:cNvPr id="763493374" name="Picture 2" descr="A picture containing logo&#10;&#10;Description automatically generated">
+                            <a:extLst>
+                              <a:ext uri="{FF2B5EF4-FFF2-40B4-BE49-F238E27FC236}">
+                                <a16:creationId xmlns:a16="http://schemas.microsoft.com/office/drawing/2014/main" id="{07C214CF-87DF-74E6-BA42-DBDC6E46CEF1}"/>
+                              </a:ext>
+                            </a:extLst>
+                          </pic:cNvPr>
+                          <pic:cNvPicPr>
+                            <a:picLocks noChangeAspect="1"/>
+                          </pic:cNvPicPr>
+                        </pic:nvPicPr>
+                        <pic:blipFill>
+                          <a:blip r:embed="rId14" cstate="screen">
+                            <a:extLst>
+                              <a:ext uri="{28A0092B-C50C-407E-A947-70E740481C1C}">
+                                <a14:useLocalDpi xmlns:a14="http://schemas.microsoft.com/office/drawing/2010/main"/>
+                              </a:ext>
+                            </a:extLst>
+                          </a:blip>
+                          <a:stretch>
+                            <a:fillRect/>
+                          </a:stretch>
+                        </pic:blipFill>
+                        <pic:spPr>
+                          <a:xfrm>
+                            <a:off x="5396459" y="1439056"/>
+                            <a:ext cx="1477010" cy="663575"/>
+                          </a:xfrm>
+                          <a:prstGeom prst="rect">
+                            <a:avLst/>
+                          </a:prstGeom>
+                        </pic:spPr>
+                      </pic:pic>
+                      <pic:pic xmlns:pic="http://schemas.openxmlformats.org/drawingml/2006/picture">
+                        <pic:nvPicPr>
+                          <pic:cNvPr id="1345910386" name="Picture 3" descr="A picture containing drawing&#10;&#10;Description automatically generated">
+                            <a:extLst>
+                              <a:ext uri="{FF2B5EF4-FFF2-40B4-BE49-F238E27FC236}">
+                                <a16:creationId xmlns:a16="http://schemas.microsoft.com/office/drawing/2014/main" id="{69E2D973-22CA-AA8E-E26B-7B78A35FA172}"/>
+                              </a:ext>
+                            </a:extLst>
+                          </pic:cNvPr>
+                          <pic:cNvPicPr>
+                            <a:picLocks noChangeAspect="1"/>
+                          </pic:cNvPicPr>
+                        </pic:nvPicPr>
+                        <pic:blipFill>
+                          <a:blip r:embed="rId15" cstate="screen">
+                            <a:extLst>
+                              <a:ext uri="{28A0092B-C50C-407E-A947-70E740481C1C}">
+                                <a14:useLocalDpi xmlns:a14="http://schemas.microsoft.com/office/drawing/2010/main"/>
+                              </a:ext>
+                            </a:extLst>
+                          </a:blip>
+                          <a:stretch>
+                            <a:fillRect/>
+                          </a:stretch>
+                        </pic:blipFill>
+                        <pic:spPr>
+                          <a:xfrm>
+                            <a:off x="0" y="1543987"/>
+                            <a:ext cx="1858010" cy="591185"/>
+                          </a:xfrm>
+                          <a:prstGeom prst="rect">
+                            <a:avLst/>
+                          </a:prstGeom>
+                        </pic:spPr>
+                      </pic:pic>
+                      <pic:pic xmlns:pic="http://schemas.openxmlformats.org/drawingml/2006/picture">
+                        <pic:nvPicPr>
+                          <pic:cNvPr id="281666725" name="Picture 6" descr="A blue and green logo&#10;&#10;AI-generated content may be incorrect.">
+                            <a:extLst>
+                              <a:ext uri="{FF2B5EF4-FFF2-40B4-BE49-F238E27FC236}">
+                                <a16:creationId xmlns:a16="http://schemas.microsoft.com/office/drawing/2014/main" id="{7583C96B-B785-E707-261F-6EB8A421DCB1}"/>
+                              </a:ext>
+                            </a:extLst>
+                          </pic:cNvPr>
+                          <pic:cNvPicPr>
+                            <a:picLocks noChangeAspect="1"/>
+                          </pic:cNvPicPr>
+                        </pic:nvPicPr>
+                        <pic:blipFill>
+                          <a:blip r:embed="rId16" cstate="screen">
+                            <a:extLst>
+                              <a:ext uri="{28A0092B-C50C-407E-A947-70E740481C1C}">
+                                <a14:useLocalDpi xmlns:a14="http://schemas.microsoft.com/office/drawing/2010/main"/>
+                              </a:ext>
+                            </a:extLst>
+                          </a:blip>
+                          <a:stretch>
+                            <a:fillRect/>
+                          </a:stretch>
+                        </pic:blipFill>
+                        <pic:spPr>
+                          <a:xfrm>
+                            <a:off x="2188564" y="1184223"/>
+                            <a:ext cx="815975" cy="977900"/>
+                          </a:xfrm>
+                          <a:prstGeom prst="rect">
+                            <a:avLst/>
+                          </a:prstGeom>
+                        </pic:spPr>
+                      </pic:pic>
+                      <pic:pic xmlns:pic="http://schemas.openxmlformats.org/drawingml/2006/picture">
+                        <pic:nvPicPr>
+                          <pic:cNvPr id="1982592625" name="Picture 7" descr="A close-up of a logo&#10;&#10;AI-generated content may be incorrect.">
+                            <a:extLst>
+                              <a:ext uri="{FF2B5EF4-FFF2-40B4-BE49-F238E27FC236}">
+                                <a16:creationId xmlns:a16="http://schemas.microsoft.com/office/drawing/2014/main" id="{8DF08FE6-675D-D8E0-94DE-B7E2355D2660}"/>
+                              </a:ext>
+                            </a:extLst>
+                          </pic:cNvPr>
+                          <pic:cNvPicPr>
+                            <a:picLocks noChangeAspect="1"/>
+                          </pic:cNvPicPr>
+                        </pic:nvPicPr>
+                        <pic:blipFill>
+                          <a:blip r:embed="rId17" cstate="screen">
+                            <a:extLst>
+                              <a:ext uri="{28A0092B-C50C-407E-A947-70E740481C1C}">
+                                <a14:useLocalDpi xmlns:a14="http://schemas.microsoft.com/office/drawing/2010/main"/>
+                              </a:ext>
+                            </a:extLst>
+                          </a:blip>
+                          <a:stretch>
+                            <a:fillRect/>
+                          </a:stretch>
+                        </pic:blipFill>
+                        <pic:spPr>
+                          <a:xfrm>
+                            <a:off x="3492708" y="719528"/>
+                            <a:ext cx="1268730" cy="663575"/>
+                          </a:xfrm>
+                          <a:prstGeom prst="rect">
+                            <a:avLst/>
+                          </a:prstGeom>
+                        </pic:spPr>
+                      </pic:pic>
+                      <pic:pic xmlns:pic="http://schemas.openxmlformats.org/drawingml/2006/picture">
+                        <pic:nvPicPr>
+                          <pic:cNvPr id="2101309964" name="Picture 9" descr="A close-up of a logo&#10;&#10;AI-generated content may be incorrect.">
+                            <a:extLst>
+                              <a:ext uri="{FF2B5EF4-FFF2-40B4-BE49-F238E27FC236}">
+                                <a16:creationId xmlns:a16="http://schemas.microsoft.com/office/drawing/2014/main" id="{AAA4F421-708A-AF24-73EF-708FD619CEB3}"/>
+                              </a:ext>
+                            </a:extLst>
+                          </pic:cNvPr>
+                          <pic:cNvPicPr>
+                            <a:picLocks noChangeAspect="1"/>
+                          </pic:cNvPicPr>
+                        </pic:nvPicPr>
+                        <pic:blipFill>
+                          <a:blip r:embed="rId18" cstate="screen">
+                            <a:extLst>
+                              <a:ext uri="{28A0092B-C50C-407E-A947-70E740481C1C}">
+                                <a14:useLocalDpi xmlns:a14="http://schemas.microsoft.com/office/drawing/2010/main"/>
+                              </a:ext>
+                            </a:extLst>
+                          </a:blip>
+                          <a:stretch>
+                            <a:fillRect/>
+                          </a:stretch>
+                        </pic:blipFill>
+                        <pic:spPr>
+                          <a:xfrm>
+                            <a:off x="3492708" y="0"/>
+                            <a:ext cx="1269365" cy="663575"/>
+                          </a:xfrm>
+                          <a:prstGeom prst="rect">
+                            <a:avLst/>
+                          </a:prstGeom>
+                        </pic:spPr>
+                      </pic:pic>
+                      <pic:pic xmlns:pic="http://schemas.openxmlformats.org/drawingml/2006/picture">
+                        <pic:nvPicPr>
+                          <pic:cNvPr id="1796106400" name="Picture 10" descr="A close-up of a logo&#10;&#10;AI-generated content may be incorrect.">
+                            <a:extLst>
+                              <a:ext uri="{FF2B5EF4-FFF2-40B4-BE49-F238E27FC236}">
+                                <a16:creationId xmlns:a16="http://schemas.microsoft.com/office/drawing/2014/main" id="{23C7266A-68C3-7DB5-30CC-6C442C7AA6FA}"/>
+                              </a:ext>
+                            </a:extLst>
+                          </pic:cNvPr>
+                          <pic:cNvPicPr>
+                            <a:picLocks noChangeAspect="1"/>
+                          </pic:cNvPicPr>
+                        </pic:nvPicPr>
+                        <pic:blipFill>
+                          <a:blip r:embed="rId19" cstate="screen">
+                            <a:extLst>
+                              <a:ext uri="{28A0092B-C50C-407E-A947-70E740481C1C}">
+                                <a14:useLocalDpi xmlns:a14="http://schemas.microsoft.com/office/drawing/2010/main"/>
+                              </a:ext>
+                            </a:extLst>
+                          </a:blip>
+                          <a:stretch>
+                            <a:fillRect/>
+                          </a:stretch>
+                        </pic:blipFill>
+                        <pic:spPr>
+                          <a:xfrm>
+                            <a:off x="3492708" y="1439056"/>
+                            <a:ext cx="1268730" cy="663575"/>
+                          </a:xfrm>
+                          <a:prstGeom prst="rect">
+                            <a:avLst/>
+                          </a:prstGeom>
+                        </pic:spPr>
+                      </pic:pic>
+                      <pic:pic xmlns:pic="http://schemas.openxmlformats.org/drawingml/2006/picture">
+                        <pic:nvPicPr>
+                          <pic:cNvPr id="1699008980" name="Picture 11" descr="A black and white sign with white text&#10;&#10;AI-generated content may be incorrect.">
+                            <a:extLst>
+                              <a:ext uri="{FF2B5EF4-FFF2-40B4-BE49-F238E27FC236}">
+                                <a16:creationId xmlns:a16="http://schemas.microsoft.com/office/drawing/2014/main" id="{59DDB122-4151-C282-69AC-8668934C403C}"/>
+                              </a:ext>
+                            </a:extLst>
+                          </pic:cNvPr>
+                          <pic:cNvPicPr>
+                            <a:picLocks noChangeAspect="1"/>
+                          </pic:cNvPicPr>
+                        </pic:nvPicPr>
+                        <pic:blipFill>
+                          <a:blip r:embed="rId20" cstate="screen">
+                            <a:extLst>
+                              <a:ext uri="{28A0092B-C50C-407E-A947-70E740481C1C}">
+                                <a14:useLocalDpi xmlns:a14="http://schemas.microsoft.com/office/drawing/2010/main"/>
+                              </a:ext>
+                            </a:extLst>
+                          </a:blip>
+                          <a:srcRect/>
+                          <a:stretch/>
+                        </pic:blipFill>
+                        <pic:spPr>
+                          <a:xfrm>
+                            <a:off x="5456420" y="644577"/>
+                            <a:ext cx="1415415" cy="667385"/>
+                          </a:xfrm>
+                          <a:prstGeom prst="rect">
+                            <a:avLst/>
+                          </a:prstGeom>
+                        </pic:spPr>
+                      </pic:pic>
+                      <pic:pic xmlns:pic="http://schemas.openxmlformats.org/drawingml/2006/picture">
+                        <pic:nvPicPr>
+                          <pic:cNvPr id="1003607936" name="Picture 16" descr="A group of logos on a black background&#10;&#10;AI-generated content may be incorrect.">
+                            <a:extLst>
+                              <a:ext uri="{FF2B5EF4-FFF2-40B4-BE49-F238E27FC236}">
+                                <a16:creationId xmlns:a16="http://schemas.microsoft.com/office/drawing/2014/main" id="{1A2D9C8E-17F0-7AE2-F370-FA894E35CD35}"/>
+                              </a:ext>
+                            </a:extLst>
+                          </pic:cNvPr>
+                          <pic:cNvPicPr>
+                            <a:picLocks noChangeAspect="1"/>
+                          </pic:cNvPicPr>
+                        </pic:nvPicPr>
+                        <pic:blipFill>
+                          <a:blip r:embed="rId21" cstate="screen">
+                            <a:extLst>
+                              <a:ext uri="{28A0092B-C50C-407E-A947-70E740481C1C}">
+                                <a14:useLocalDpi xmlns:a14="http://schemas.microsoft.com/office/drawing/2010/main"/>
+                              </a:ext>
+                            </a:extLst>
+                          </a:blip>
+                          <a:srcRect/>
+                          <a:stretch>
+                            <a:fillRect/>
+                          </a:stretch>
+                        </pic:blipFill>
+                        <pic:spPr>
+                          <a:xfrm>
+                            <a:off x="7240249" y="944380"/>
+                            <a:ext cx="2402205" cy="1149985"/>
+                          </a:xfrm>
+                          <a:prstGeom prst="rect">
+                            <a:avLst/>
+                          </a:prstGeom>
+                        </pic:spPr>
+                      </pic:pic>
+                    </wpg:wgp>
+                  </a:graphicData>
+                </a:graphic>
+                <wp14:sizeRelH relativeFrom="margin">
+                  <wp14:pctWidth>0</wp14:pctWidth>
+                </wp14:sizeRelH>
+                <wp14:sizeRelV relativeFrom="margin">
+                  <wp14:pctHeight>0</wp14:pctHeight>
+                </wp14:sizeRelV>
+              </wp:anchor>
+            </w:drawing>
+          </mc:Choice>
+          <mc:Fallback>
+            <w:pict>
+              <v:group w14:anchorId="1A256209" id="Group 12" o:spid="_x0000_s1026" style="position:absolute;margin-left:-52pt;margin-top:573.05pt;width:555.05pt;height:124.45pt;z-index:251665426;mso-width-relative:margin;mso-height-relative:margin" coordsize="96424,21621" o:gfxdata="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">
+                <v:shapetype id="_x0000_t75" coordsize="21600,21600" o:spt="75" o:preferrelative="t" path="m@4@5l@4@11@9@11@9@5xe" filled="f" stroked="f">
+                  <v:stroke joinstyle="miter"/>
+                  <v:formulas>
+                    <v:f eqn="if lineDrawn pixelLineWidth 0"/>
+                    <v:f eqn="sum @0 1 0"/>
+                    <v:f eqn="sum 0 0 @1"/>
+                    <v:f eqn="prod @2 1 2"/>
+                    <v:f eqn="prod @3 21600 pixelWidth"/>
+                    <v:f eqn="prod @3 21600 pixelHeight"/>
+                    <v:f eqn="sum @0 0 1"/>
+                    <v:f eqn="prod @6 1 2"/>
+                    <v:f eqn="prod @7 21600 pixelWidth"/>
+                    <v:f eqn="sum @8 21600 0"/>
+                    <v:f eqn="prod @7 21600 pixelHeight"/>
+                    <v:f eqn="sum @10 21600 0"/>
+                  </v:formulas>
+                  <v:path o:extrusionok="f" gradientshapeok="t" o:connecttype="rect"/>
+                  <o:lock v:ext="edit" aspectratio="t"/>
+                </v:shapetype>
+                <v:shape id="Picture 2" o:spid="_x0000_s1027" type="#_x0000_t75" alt="A picture containing logo&#10;&#10;Description automatically generated" style="position:absolute;left:53964;top:14390;width:14770;height:6636;visibility:visible;mso-wrap-style:square" o:gfxdata="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">
+                  <v:imagedata r:id="rId22" o:title="A picture containing logo&#10;&#10;Description automatically generated"/>
+                </v:shape>
+                <v:shape id="Picture 3" o:spid="_x0000_s1028" type="#_x0000_t75" alt="A picture containing drawing&#10;&#10;Description automatically generated" style="position:absolute;top:15439;width:18580;height:5912;visibility:visible;mso-wrap-style:square" o:gfxdata="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">
+                  <v:imagedata r:id="rId23" o:title="A picture containing drawing&#10;&#10;Description automatically generated"/>
+                </v:shape>
+                <v:shape id="Picture 6" o:spid="_x0000_s1029" type="#_x0000_t75" alt="A blue and green logo&#10;&#10;AI-generated content may be incorrect." style="position:absolute;left:21885;top:11842;width:8160;height:9779;visibility:visible;mso-wrap-style:square" o:gfxdata="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">
+                  <v:imagedata r:id="rId24" o:title="A blue and green logo&#10;&#10;AI-generated content may be incorrect"/>
+                </v:shape>
+                <v:shape id="Picture 7" o:spid="_x0000_s1030" type="#_x0000_t75" alt="A close-up of a logo&#10;&#10;AI-generated content may be incorrect." style="position:absolute;left:34927;top:7195;width:12687;height:6636;visibility:visible;mso-wrap-style:square" o:gfxdata="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">
+                  <v:imagedata r:id="rId25" o:title="A close-up of a logo&#10;&#10;AI-generated content may be incorrect"/>
+                </v:shape>
+                <v:shape id="Picture 9" o:spid="_x0000_s1031" type="#_x0000_t75" alt="A close-up of a logo&#10;&#10;AI-generated content may be incorrect." style="position:absolute;left:34927;width:12693;height:6635;visibility:visible;mso-wrap-style:square" o:gfxdata="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">
+                  <v:imagedata r:id="rId26" o:title="A close-up of a logo&#10;&#10;AI-generated content may be incorrect"/>
+                </v:shape>
+                <v:shape id="Picture 10" o:spid="_x0000_s1032" type="#_x0000_t75" alt="A close-up of a logo&#10;&#10;AI-generated content may be incorrect." style="position:absolute;left:34927;top:14390;width:12687;height:6636;visibility:visible;mso-wrap-style:square" o:gfxdata="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">
+                  <v:imagedata r:id="rId27" o:title="A close-up of a logo&#10;&#10;AI-generated content may be incorrect"/>
+                </v:shape>
+                <v:shape id="Picture 11" o:spid="_x0000_s1033" type="#_x0000_t75" alt="A black and white sign with white text&#10;&#10;AI-generated content may be incorrect." style="position:absolute;left:54564;top:6445;width:14154;height:6674;visibility:visible;mso-wrap-style:square" o:gfxdata="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">
+                  <v:imagedata r:id="rId28" o:title="A black and white sign with white text&#10;&#10;AI-generated content may be incorrect"/>
+                </v:shape>
+                <v:shape id="Picture 16" o:spid="_x0000_s1034" type="#_x0000_t75" alt="A group of logos on a black background&#10;&#10;AI-generated content may be incorrect." style="position:absolute;left:72402;top:9443;width:24022;height:11500;visibility:visible;mso-wrap-style:square" o:gfxdata="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">
+                  <v:imagedata r:id="rId29" o:title="A group of logos on a black background&#10;&#10;AI-generated content may be incorrect"/>
+                </v:shape>
+              </v:group>
+            </w:pict>
+          </mc:Fallback>
+        </mc:AlternateContent>
+      </w:r>
+      <w:r>
+        <w:rPr>
+          <w:bCs/>
+          <w:noProof/>
+        </w:rPr>
+        <mc:AlternateContent>
           <mc:Choice Requires="wps">
             <w:drawing>
-              <wp:anchor distT="0" distB="0" distL="114300" distR="114300" simplePos="0" relativeHeight="251657219" behindDoc="0" locked="0" layoutInCell="1" allowOverlap="1" wp14:anchorId="25BCA1CF" wp14:editId="765BD73C">
+              <wp:anchor distT="0" distB="0" distL="114300" distR="114300" simplePos="0" relativeHeight="251657219" behindDoc="0" locked="0" layoutInCell="1" allowOverlap="1" wp14:anchorId="25BCA1CF" wp14:editId="2984E41C">
                 <wp:simplePos x="0" y="0"/>
                 <wp:positionH relativeFrom="margin">
                   <wp:posOffset>-253497</wp:posOffset>
@@ -614,67 +990,7 @@
           <w:noProof/>
         </w:rPr>
         <w:drawing>
-          <wp:anchor distT="0" distB="0" distL="114300" distR="114300" simplePos="0" relativeHeight="251657226" behindDoc="0" locked="0" layoutInCell="1" allowOverlap="1" wp14:anchorId="54DFBD68" wp14:editId="7A8E971D">
-            <wp:simplePos x="0" y="0"/>
-            <wp:positionH relativeFrom="column">
-              <wp:posOffset>1842770</wp:posOffset>
-            </wp:positionH>
-            <wp:positionV relativeFrom="paragraph">
-              <wp:posOffset>7636963</wp:posOffset>
-            </wp:positionV>
-            <wp:extent cx="4323080" cy="991870"/>
-            <wp:effectExtent l="0" t="0" r="0" b="0"/>
-            <wp:wrapNone/>
-            <wp:docPr id="1759529464" name="Picture 74" descr="A black and white sign with a person and a tree&#10;&#10;Description automatically generated"/>
-            <wp:cNvGraphicFramePr>
-              <a:graphicFrameLocks xmlns:a="http://schemas.openxmlformats.org/drawingml/2006/main" noChangeAspect="1"/>
-            </wp:cNvGraphicFramePr>
-            <a:graphic xmlns:a="http://schemas.openxmlformats.org/drawingml/2006/main">
-              <a:graphicData uri="http://schemas.openxmlformats.org/drawingml/2006/picture">
-                <pic:pic xmlns:pic="http://schemas.openxmlformats.org/drawingml/2006/picture">
-                  <pic:nvPicPr>
-                    <pic:cNvPr id="1759529464" name="Picture 74" descr="A black and white sign with a person and a tree&#10;&#10;Description automatically generated"/>
-                    <pic:cNvPicPr/>
-                  </pic:nvPicPr>
-                  <pic:blipFill>
-                    <a:blip r:embed="rId14" cstate="print">
-                      <a:extLst>
-                        <a:ext uri="{28A0092B-C50C-407E-A947-70E740481C1C}">
-                          <a14:useLocalDpi xmlns:a14="http://schemas.microsoft.com/office/drawing/2010/main" val="0"/>
-                        </a:ext>
-                      </a:extLst>
-                    </a:blip>
-                    <a:stretch>
-                      <a:fillRect/>
-                    </a:stretch>
-                  </pic:blipFill>
-                  <pic:spPr>
-                    <a:xfrm>
-                      <a:off x="0" y="0"/>
-                      <a:ext cx="4323080" cy="991870"/>
-                    </a:xfrm>
-                    <a:prstGeom prst="rect">
-                      <a:avLst/>
-                    </a:prstGeom>
-                  </pic:spPr>
-                </pic:pic>
-              </a:graphicData>
-            </a:graphic>
-            <wp14:sizeRelH relativeFrom="page">
-              <wp14:pctWidth>0</wp14:pctWidth>
-            </wp14:sizeRelH>
-            <wp14:sizeRelV relativeFrom="page">
-              <wp14:pctHeight>0</wp14:pctHeight>
-            </wp14:sizeRelV>
-          </wp:anchor>
-        </w:drawing>
-      </w:r>
-      <w:r>
-        <w:rPr>
-          <w:noProof/>
-        </w:rPr>
-        <w:drawing>
-          <wp:inline distT="0" distB="0" distL="0" distR="0" wp14:anchorId="48375678" wp14:editId="4CFACC37">
+          <wp:inline distT="0" distB="0" distL="0" distR="0" wp14:anchorId="48375678" wp14:editId="3BF6AEBF">
             <wp:extent cx="826135" cy="1439545"/>
             <wp:effectExtent l="0" t="0" r="0" b="0"/>
             <wp:docPr id="1585102273" name="Picture 1" descr="A sign with red and white text&#10;&#10;Description automatically generated"/>
@@ -689,7 +1005,7 @@
                     <pic:cNvPicPr/>
                   </pic:nvPicPr>
                   <pic:blipFill>
-                    <a:blip r:embed="rId15">
+                    <a:blip r:embed="rId30">
                       <a:extLst>
                         <a:ext uri="{28A0092B-C50C-407E-A947-70E740481C1C}">
                           <a14:useLocalDpi xmlns:a14="http://schemas.microsoft.com/office/drawing/2010/main" val="0"/>
@@ -1342,7 +1658,7 @@
                     <pic:cNvPicPr/>
                   </pic:nvPicPr>
                   <pic:blipFill>
-                    <a:blip r:embed="rId16"/>
+                    <a:blip r:embed="rId31"/>
                     <a:stretch>
                       <a:fillRect/>
                     </a:stretch>
@@ -5285,18 +5601,18 @@
           <w:szCs w:val="24"/>
         </w:rPr>
         <w:drawing>
-          <wp:anchor distT="0" distB="0" distL="114300" distR="114300" simplePos="0" relativeHeight="251657222" behindDoc="0" locked="0" layoutInCell="1" allowOverlap="1" wp14:anchorId="39BDAF95" wp14:editId="7FE4C7ED">
+          <wp:anchor distT="0" distB="0" distL="114300" distR="114300" simplePos="0" relativeHeight="251657222" behindDoc="0" locked="0" layoutInCell="1" allowOverlap="1" wp14:anchorId="39BDAF95" wp14:editId="1CC87EA4">
             <wp:simplePos x="0" y="0"/>
             <wp:positionH relativeFrom="column">
-              <wp:posOffset>-977900</wp:posOffset>
+              <wp:posOffset>-974795</wp:posOffset>
             </wp:positionH>
             <wp:positionV relativeFrom="paragraph">
-              <wp:posOffset>234950</wp:posOffset>
+              <wp:posOffset>231894</wp:posOffset>
             </wp:positionV>
-            <wp:extent cx="7610475" cy="6804709"/>
-            <wp:effectExtent l="0" t="0" r="0" b="0"/>
+            <wp:extent cx="7604516" cy="6804709"/>
+            <wp:effectExtent l="0" t="0" r="3175" b="0"/>
             <wp:wrapNone/>
-            <wp:docPr id="875574388" name="Picture 875574388" descr="Graphical user interface&#10;&#10;Description automatically generated"/>
+            <wp:docPr id="875574388" name="Picture 875574388"/>
             <wp:cNvGraphicFramePr>
               <a:graphicFrameLocks xmlns:a="http://schemas.openxmlformats.org/drawingml/2006/main" noChangeAspect="1"/>
             </wp:cNvGraphicFramePr>
@@ -5304,14 +5620,14 @@
               <a:graphicData uri="http://schemas.openxmlformats.org/drawingml/2006/picture">
                 <pic:pic xmlns:pic="http://schemas.openxmlformats.org/drawingml/2006/picture">
                   <pic:nvPicPr>
-                    <pic:cNvPr id="32" name="Picture 32" descr="Graphical user interface&#10;&#10;Description automatically generated"/>
+                    <pic:cNvPr id="875574388" name="Picture 875574388"/>
                     <pic:cNvPicPr/>
                   </pic:nvPicPr>
                   <pic:blipFill>
-                    <a:blip r:embed="rId21" cstate="email">
+                    <a:blip r:embed="rId36">
                       <a:extLst>
                         <a:ext uri="{28A0092B-C50C-407E-A947-70E740481C1C}">
-                          <a14:useLocalDpi xmlns:a14="http://schemas.microsoft.com/office/drawing/2010/main"/>
+                          <a14:useLocalDpi xmlns:a14="http://schemas.microsoft.com/office/drawing/2010/main" val="0"/>
                         </a:ext>
                       </a:extLst>
                     </a:blip>
@@ -5322,7 +5638,7 @@
                   <pic:spPr>
                     <a:xfrm>
                       <a:off x="0" y="0"/>
-                      <a:ext cx="7610475" cy="6804709"/>
+                      <a:ext cx="7604516" cy="6804709"/>
                     </a:xfrm>
                     <a:prstGeom prst="rect">
                       <a:avLst/>
@@ -5574,7 +5890,7 @@
                           </pic:cNvPicPr>
                         </pic:nvPicPr>
                         <pic:blipFill>
-                          <a:blip r:embed="rId22">
+                          <a:blip r:embed="rId37">
                             <a:extLst>
                               <a:ext uri="{28A0092B-C50C-407E-A947-70E740481C1C}">
                                 <a14:useLocalDpi xmlns:a14="http://schemas.microsoft.com/office/drawing/2010/main" val="0"/>
@@ -5614,7 +5930,7 @@
                           </pic:cNvPicPr>
                         </pic:nvPicPr>
                         <pic:blipFill>
-                          <a:blip r:embed="rId23" cstate="print">
+                          <a:blip r:embed="rId38" cstate="print">
                             <a:extLst>
                               <a:ext uri="{28A0092B-C50C-407E-A947-70E740481C1C}">
                                 <a14:useLocalDpi xmlns:a14="http://schemas.microsoft.com/office/drawing/2010/main" val="0"/>
@@ -5649,7 +5965,7 @@
                           </pic:cNvPicPr>
                         </pic:nvPicPr>
                         <pic:blipFill>
-                          <a:blip r:embed="rId24">
+                          <a:blip r:embed="rId39">
                             <a:clrChange>
                               <a:clrFrom>
                                 <a:srgbClr val="FFFFFF"/>
@@ -5692,13 +6008,13 @@
             <w:pict>
               <v:group w14:anchorId="682D241F" id="Group 33" o:spid="_x0000_s1026" style="position:absolute;margin-left:-69.9pt;margin-top:13.3pt;width:593.1pt;height:619.5pt;z-index:251660306" coordsize="75323,78675" o:gfxdata="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">
                 <v:shape id="Picture 1423970209" o:spid="_x0000_s1027" type="#_x0000_t75" alt="Logo, company name&#10;&#10;Description automatically generated" style="position:absolute;width:75323;height:71342;visibility:visible;mso-wrap-style:square" o:gfxdata="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">
-                  <v:imagedata r:id="rId35" o:title="Logo, company name&#10;&#10;Description automatically generated"/>
+                  <v:imagedata r:id="rId40" o:title="Logo, company name&#10;&#10;Description automatically generated"/>
                 </v:shape>
                 <v:shape id="Picture 24" o:spid="_x0000_s1028" type="#_x0000_t75" alt="Logo&#10;&#10;Description automatically generated" style="position:absolute;left:50695;top:68714;width:14865;height:6655;visibility:visible;mso-wrap-style:square" o:gfxdata="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">
-                  <v:imagedata r:id="rId36" o:title="Logo&#10;&#10;Description automatically generated"/>
+                  <v:imagedata r:id="rId41" o:title="Logo&#10;&#10;Description automatically generated"/>
                 </v:shape>
                 <v:shape id="Picture 2" o:spid="_x0000_s1029" type="#_x0000_t75" alt="Hsl Compliance Ltd" style="position:absolute;left:6858;top:66966;width:21640;height:11709;visibility:visible;mso-wrap-style:square" o:gfxdata="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">
-                  <v:imagedata r:id="rId37" o:title="Hsl Compliance Ltd" chromakey="white"/>
+                  <v:imagedata r:id="rId42" o:title="Hsl Compliance Ltd" chromakey="white"/>
                 </v:shape>
               </v:group>
             </w:pict>
@@ -9819,7 +10135,7 @@
             <w:tcW w:w="2285" w:type="dxa"/>
           </w:tcPr>
           <w:p>
-            <w:hyperlink r:id="rId38" w:history="1">
+            <w:hyperlink r:id="rId43" w:history="1">
               <w:r>
                 <w:rPr>
                   <w:rStyle w:val="Hyperlink"/>
@@ -10465,7 +10781,7 @@
                     <pic:cNvPicPr/>
                   </pic:nvPicPr>
                   <pic:blipFill>
-                    <a:blip r:embed="rId39">
+                    <a:blip r:embed="rId44">
                       <a:extLst>
                         <a:ext uri="{28A0092B-C50C-407E-A947-70E740481C1C}">
                           <a14:useLocalDpi xmlns:a14="http://schemas.microsoft.com/office/drawing/2010/main" val="0"/>
@@ -10507,7 +10823,7 @@
         <mc:AlternateContent>
           <mc:Choice Requires="wpg">
             <w:drawing>
-              <wp:anchor distT="0" distB="0" distL="114300" distR="114300" simplePos="0" relativeHeight="251657228" behindDoc="0" locked="0" layoutInCell="1" allowOverlap="1" wp14:anchorId="392E5ACB" wp14:editId="2971C861">
+              <wp:anchor distT="0" distB="0" distL="114300" distR="114300" simplePos="0" relativeHeight="251657228" behindDoc="0" locked="0" layoutInCell="1" allowOverlap="1" wp14:anchorId="392E5ACB" wp14:editId="41F001EE">
                 <wp:simplePos x="0" y="0"/>
                 <wp:positionH relativeFrom="column">
                   <wp:posOffset>-786130</wp:posOffset>
@@ -10526,10 +10842,10 @@
                       <wpg:cNvGrpSpPr/>
                       <wpg:grpSpPr>
                         <a:xfrm>
-                          <a:off x="0" y="0"/>
-                          <a:ext cx="7320280" cy="4235450"/>
-                          <a:chOff x="0" y="0"/>
-                          <a:chExt cx="7320501" cy="4235506"/>
+                          <a:off x="0" y="63698"/>
+                          <a:ext cx="7320280" cy="4171752"/>
+                          <a:chOff x="0" y="63699"/>
+                          <a:chExt cx="7320501" cy="4171807"/>
                         </a:xfrm>
                       </wpg:grpSpPr>
                       <pic:pic xmlns:pic="http://schemas.openxmlformats.org/drawingml/2006/picture">
@@ -10540,21 +10856,20 @@
                           </pic:cNvPicPr>
                         </pic:nvPicPr>
                         <pic:blipFill>
-                          <a:blip r:embed="rId11">
+                          <a:blip r:embed="rId45">
                             <a:extLst>
                               <a:ext uri="{28A0092B-C50C-407E-A947-70E740481C1C}">
-                                <a14:useLocalDpi xmlns:a14="http://schemas.microsoft.com/office/drawing/2010/main"/>
+                                <a14:useLocalDpi xmlns:a14="http://schemas.microsoft.com/office/drawing/2010/main" val="0"/>
                               </a:ext>
                             </a:extLst>
                           </a:blip>
-                          <a:stretch>
-                            <a:fillRect/>
-                          </a:stretch>
+                          <a:srcRect/>
+                          <a:stretch/>
                         </pic:blipFill>
                         <pic:spPr>
                           <a:xfrm>
-                            <a:off x="1876508" y="0"/>
-                            <a:ext cx="3717925" cy="584200"/>
+                            <a:off x="1876508" y="63699"/>
+                            <a:ext cx="3717925" cy="456802"/>
                           </a:xfrm>
                           <a:prstGeom prst="rect">
                             <a:avLst/>
@@ -10796,7 +11111,7 @@
                           </pic:cNvPicPr>
                         </pic:nvPicPr>
                         <pic:blipFill>
-                          <a:blip r:embed="rId40" cstate="print">
+                          <a:blip r:embed="rId46" cstate="print">
                             <a:extLst>
                               <a:ext uri="{28A0092B-C50C-407E-A947-70E740481C1C}">
                                 <a14:useLocalDpi xmlns:a14="http://schemas.microsoft.com/office/drawing/2010/main" val="0"/>
@@ -10825,7 +11140,7 @@
                           </pic:cNvPicPr>
                         </pic:nvPicPr>
                         <pic:blipFill>
-                          <a:blip r:embed="rId41" cstate="print">
+                          <a:blip r:embed="rId47" cstate="print">
                             <a:extLst>
                               <a:ext uri="{28A0092B-C50C-407E-A947-70E740481C1C}">
                                 <a14:useLocalDpi xmlns:a14="http://schemas.microsoft.com/office/drawing/2010/main" val="0"/>
@@ -10854,7 +11169,7 @@
                           </pic:cNvPicPr>
                         </pic:nvPicPr>
                         <pic:blipFill>
-                          <a:blip r:embed="rId42" cstate="print">
+                          <a:blip r:embed="rId48" cstate="print">
                             <a:extLst>
                               <a:ext uri="{28A0092B-C50C-407E-A947-70E740481C1C}">
                                 <a14:useLocalDpi xmlns:a14="http://schemas.microsoft.com/office/drawing/2010/main" val="0"/>
@@ -10886,28 +11201,9 @@
           </mc:Choice>
           <mc:Fallback>
             <w:pict>
-              <v:group w14:anchorId="392E5ACB" id="Group 32" o:spid="_x0000_s1031" style="position:absolute;margin-left:-61.9pt;margin-top:20.9pt;width:576.4pt;height:333.5pt;z-index:251657228;mso-height-relative:margin" coordsize="73205,42355" o:gfxdata="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">
-                <v:shapetype id="_x0000_t75" coordsize="21600,21600" o:spt="75" o:preferrelative="t" path="m@4@5l@4@11@9@11@9@5xe" filled="f" stroked="f">
-                  <v:stroke joinstyle="miter"/>
-                  <v:formulas>
-                    <v:f eqn="if lineDrawn pixelLineWidth 0"/>
-                    <v:f eqn="sum @0 1 0"/>
-                    <v:f eqn="sum 0 0 @1"/>
-                    <v:f eqn="prod @2 1 2"/>
-                    <v:f eqn="prod @3 21600 pixelWidth"/>
-                    <v:f eqn="prod @3 21600 pixelHeight"/>
-                    <v:f eqn="sum @0 0 1"/>
-                    <v:f eqn="prod @6 1 2"/>
-                    <v:f eqn="prod @7 21600 pixelWidth"/>
-                    <v:f eqn="sum @8 21600 0"/>
-                    <v:f eqn="prod @7 21600 pixelHeight"/>
-                    <v:f eqn="sum @10 21600 0"/>
-                  </v:formulas>
-                  <v:path o:extrusionok="f" gradientshapeok="t" o:connecttype="rect"/>
-                  <o:lock v:ext="edit" aspectratio="t"/>
-                </v:shapetype>
-                <v:shape id="Picture 522" o:spid="_x0000_s1032" type="#_x0000_t75" style="position:absolute;left:18765;width:37179;height:5842;visibility:visible;mso-wrap-style:square" o:gfxdata="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">
-                  <v:imagedata r:id="rId43" o:title=""/>
+              <v:group w14:anchorId="392E5ACB" id="Group 32" o:spid="_x0000_s1031" style="position:absolute;margin-left:-61.9pt;margin-top:20.9pt;width:576.4pt;height:333.5pt;z-index:251657228;mso-height-relative:margin" coordorigin=",636" coordsize="73205,41718" o:gfxdata="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">
+                <v:shape id="Picture 522" o:spid="_x0000_s1032" type="#_x0000_t75" style="position:absolute;left:18765;top:636;width:37179;height:4569;visibility:visible;mso-wrap-style:square" o:gfxdata="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">
+                  <v:imagedata r:id="rId49" o:title=""/>
                 </v:shape>
                 <v:shape id="Text Box 363991275" o:spid="_x0000_s1033" type="#_x0000_t202" style="position:absolute;top:27750;width:24384;height:4064;visibility:visible;mso-wrap-style:square;v-text-anchor:top" o:gfxdata="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" filled="f" stroked="f" strokeweight=".5pt">
                   <v:textbox>
@@ -11074,13 +11370,13 @@
                   </v:textbox>
                 </v:shape>
                 <v:shape id="Picture 529" o:spid="_x0000_s1036" type="#_x0000_t75" alt="A picture containing text, clipart, tableware, light&#10;&#10;Description automatically generated" style="position:absolute;left:9859;top:22979;width:4445;height:4445;visibility:visible;mso-wrap-style:square" o:gfxdata="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">
-                  <v:imagedata r:id="rId44" o:title="A picture containing text, clipart, tableware, light&#10;&#10;Description automatically generated"/>
+                  <v:imagedata r:id="rId50" o:title="A picture containing text, clipart, tableware, light&#10;&#10;Description automatically generated"/>
                 </v:shape>
                 <v:shape id="Picture 530" o:spid="_x0000_s1037" type="#_x0000_t75" alt="Icon&#10;&#10;Description automatically generated" style="position:absolute;left:34985;top:22740;width:4445;height:4445;visibility:visible;mso-wrap-style:square" o:gfxdata="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">
-                  <v:imagedata r:id="rId45" o:title="Icon&#10;&#10;Description automatically generated"/>
+                  <v:imagedata r:id="rId51" o:title="Icon&#10;&#10;Description automatically generated"/>
                 </v:shape>
                 <v:shape id="Picture 533" o:spid="_x0000_s1038" type="#_x0000_t75" alt="Icon&#10;&#10;Description automatically generated" style="position:absolute;left:57805;top:22661;width:4445;height:4445;visibility:visible;mso-wrap-style:square" o:gfxdata="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">
-                  <v:imagedata r:id="rId46" o:title="Icon&#10;&#10;Description automatically generated"/>
+                  <v:imagedata r:id="rId52" o:title="Icon&#10;&#10;Description automatically generated"/>
                 </v:shape>
               </v:group>
             </w:pict>
@@ -11832,8 +12128,8 @@
     <w:bookmarkEnd w:id="11"/>
     <w:p/>
     <w:sectPr>
-      <w:headerReference w:type="default" r:id="rId47"/>
-      <w:headerReference w:type="first" r:id="rId48"/>
+      <w:headerReference w:type="default" r:id="rId53"/>
+      <w:headerReference w:type="first" r:id="rId54"/>
       <w:pgSz w:w="11900" w:h="16840"/>
       <w:pgMar w:top="1972" w:right="1440" w:bottom="1172" w:left="1440" w:header="708" w:footer="708" w:gutter="0"/>
       <w:cols w:space="708"/>
@@ -12059,16 +12355,16 @@
         <w:noProof/>
       </w:rPr>
       <w:drawing>
-        <wp:anchor distT="0" distB="0" distL="114300" distR="114300" simplePos="0" relativeHeight="251658240" behindDoc="1" locked="0" layoutInCell="1" allowOverlap="1" wp14:anchorId="0746F6CC" wp14:editId="0D4F3153">
+        <wp:anchor distT="0" distB="0" distL="114300" distR="114300" simplePos="0" relativeHeight="251658240" behindDoc="1" locked="0" layoutInCell="1" allowOverlap="1" wp14:anchorId="0746F6CC" wp14:editId="2ED7E41F">
           <wp:simplePos x="0" y="0"/>
           <wp:positionH relativeFrom="column">
-            <wp:posOffset>-983329</wp:posOffset>
+            <wp:posOffset>-986828</wp:posOffset>
           </wp:positionH>
           <wp:positionV relativeFrom="paragraph">
-            <wp:posOffset>-457834</wp:posOffset>
+            <wp:posOffset>-449243</wp:posOffset>
           </wp:positionV>
-          <wp:extent cx="7623016" cy="10774717"/>
-          <wp:effectExtent l="0" t="0" r="0" b="0"/>
+          <wp:extent cx="7623016" cy="10755936"/>
+          <wp:effectExtent l="0" t="0" r="0" b="1270"/>
           <wp:wrapNone/>
           <wp:docPr id="7" name="Picture 7"/>
           <wp:cNvGraphicFramePr>
@@ -12078,7 +12374,7 @@
             <a:graphicData uri="http://schemas.openxmlformats.org/drawingml/2006/picture">
               <pic:pic xmlns:pic="http://schemas.openxmlformats.org/drawingml/2006/picture">
                 <pic:nvPicPr>
-                  <pic:cNvPr id="1" name="Planet_Letterhead_vFINAL.pdf"/>
+                  <pic:cNvPr id="7" name="Picture 7"/>
                   <pic:cNvPicPr/>
                 </pic:nvPicPr>
                 <pic:blipFill>
@@ -12096,7 +12392,7 @@
                 <pic:spPr>
                   <a:xfrm>
                     <a:off x="0" y="0"/>
-                    <a:ext cx="7623016" cy="10774717"/>
+                    <a:ext cx="7623016" cy="10755936"/>
                   </a:xfrm>
                   <a:prstGeom prst="rect">
                     <a:avLst/>

</xml_diff>

<commit_message>
V1.2.1 - implement cost of inaction estimation, enhance email security recommendations, and update radar chart generation logic
</commit_message>
<xml_diff>
--- a/planet_it_vciso_template.docx
+++ b/planet_it_vciso_template.docx
@@ -1072,15 +1072,7 @@
           <w:bCs/>
           <w:color w:val="EE0000"/>
         </w:rPr>
-        <w:t>I</w:t>
-      </w:r>
-      <w:r>
-        <w:rPr>
-          <w:b/>
-          <w:bCs/>
-          <w:color w:val="EE0000"/>
-        </w:rPr>
-        <w:t>nternal Discovery Guide (Consultant Only - Remove Before Sending):</w:t>
+        <w:t>Internal Discovery Guide (Consultant Only - Remove Before Sending):</w:t>
       </w:r>
     </w:p>
     <w:p>
@@ -3661,14 +3653,7 @@
           <w:b/>
           <w:bCs/>
         </w:rPr>
-        <w:t>Domain</w:t>
-      </w:r>
-      <w:r>
-        <w:rPr>
-          <w:b/>
-          <w:bCs/>
-        </w:rPr>
-        <w:t xml:space="preserve">: </w:t>
+        <w:t xml:space="preserve">Domain: </w:t>
       </w:r>
       <w:r>
         <w:t>{{ d.domain_name }}</w:t>
@@ -5428,10 +5413,14 @@
     <w:p/>
     <w:p/>
     <w:p>
+      <w:pPr>
+        <w:pStyle w:val="Heading1"/>
+      </w:pPr>
       <w:r>
         <w:t>Why Planet IT</w:t>
       </w:r>
     </w:p>
+    <w:p/>
     <w:p>
       <w:r>
         <w:t xml:space="preserve">Planet IT is a leading IT company offering complete outsourced IT solutions to organisations across the UK and Europe. Based </w:t>
@@ -10842,7 +10831,7 @@
                       <wpg:cNvGrpSpPr/>
                       <wpg:grpSpPr>
                         <a:xfrm>
-                          <a:off x="0" y="63698"/>
+                          <a:off x="0" y="0"/>
                           <a:ext cx="7320280" cy="4171752"/>
                           <a:chOff x="0" y="63699"/>
                           <a:chExt cx="7320501" cy="4171807"/>
@@ -14332,10 +14321,6 @@
 </file>
 
 <file path=customXml/item1.xml><?xml version="1.0" encoding="utf-8"?>
-<b:Sources xmlns:b="http://schemas.openxmlformats.org/officeDocument/2006/bibliography" xmlns="http://schemas.openxmlformats.org/officeDocument/2006/bibliography" SelectedStyle="\APASixthEditionOfficeOnline.xsl" StyleName="APA" Version="6"/>
-</file>
-
-<file path=customXml/item2.xml><?xml version="1.0" encoding="utf-8"?>
 <ct:contentTypeSchema xmlns:ct="http://schemas.microsoft.com/office/2006/metadata/contentType" xmlns:ma="http://schemas.microsoft.com/office/2006/metadata/properties/metaAttributes" ct:_="" ma:_="" ma:contentTypeName="Document" ma:contentTypeID="0x01010035785702D987474A98E5EB52BEDD3AA6" ma:contentTypeVersion="19" ma:contentTypeDescription="Create a new document." ma:contentTypeScope="" ma:versionID="7475e8a14b23e3b44613142ca3702c71">
   <xsd:schema xmlns:xsd="http://www.w3.org/2001/XMLSchema" xmlns:xs="http://www.w3.org/2001/XMLSchema" xmlns:p="http://schemas.microsoft.com/office/2006/metadata/properties" xmlns:ns1="http://schemas.microsoft.com/sharepoint/v3" xmlns:ns2="bc555557-3e8b-4e67-83dc-4a843c87bf48" xmlns:ns3="13e5e634-19bb-4da3-8eb1-d732f895062a" targetNamespace="http://schemas.microsoft.com/office/2006/metadata/properties" ma:root="true" ma:fieldsID="a0e591cb8f16aef1e2d445ad70521c76" ns1:_="" ns2:_="" ns3:_="">
     <xsd:import namespace="http://schemas.microsoft.com/sharepoint/v3"/>
@@ -14593,6 +14578,15 @@
 </ct:contentTypeSchema>
 </file>
 
+<file path=customXml/item2.xml><?xml version="1.0" encoding="utf-8"?>
+<?mso-contentType ?>
+<FormTemplates xmlns="http://schemas.microsoft.com/sharepoint/v3/contenttype/forms">
+  <Display>DocumentLibraryForm</Display>
+  <Edit>DocumentLibraryForm</Edit>
+  <New>DocumentLibraryForm</New>
+</FormTemplates>
+</file>
+
 <file path=customXml/item3.xml><?xml version="1.0" encoding="utf-8"?>
 <p:properties xmlns:p="http://schemas.microsoft.com/office/2006/metadata/properties" xmlns:xsi="http://www.w3.org/2001/XMLSchema-instance" xmlns:pc="http://schemas.microsoft.com/office/infopath/2007/PartnerControls">
   <documentManagement>
@@ -14634,23 +14628,10 @@
 </file>
 
 <file path=customXml/item4.xml><?xml version="1.0" encoding="utf-8"?>
-<?mso-contentType ?>
-<FormTemplates xmlns="http://schemas.microsoft.com/sharepoint/v3/contenttype/forms">
-  <Display>DocumentLibraryForm</Display>
-  <Edit>DocumentLibraryForm</Edit>
-  <New>DocumentLibraryForm</New>
-</FormTemplates>
+<b:Sources xmlns:b="http://schemas.openxmlformats.org/officeDocument/2006/bibliography" xmlns="http://schemas.openxmlformats.org/officeDocument/2006/bibliography" SelectedStyle="\APASixthEditionOfficeOnline.xsl" StyleName="APA" Version="6"/>
 </file>
 
 <file path=customXml/itemProps1.xml><?xml version="1.0" encoding="utf-8"?>
-<ds:datastoreItem xmlns:ds="http://schemas.openxmlformats.org/officeDocument/2006/customXml" ds:itemID="{41B34B53-803B-4600-951E-8C7B6ABDE6A5}">
-  <ds:schemaRefs>
-    <ds:schemaRef ds:uri="http://schemas.openxmlformats.org/officeDocument/2006/bibliography"/>
-  </ds:schemaRefs>
-</ds:datastoreItem>
-</file>
-
-<file path=customXml/itemProps2.xml><?xml version="1.0" encoding="utf-8"?>
 <ds:datastoreItem xmlns:ds="http://schemas.openxmlformats.org/officeDocument/2006/customXml" ds:itemID="{7F9D1B01-7FEE-4553-9877-3B31209422E5}">
   <ds:schemaRefs>
     <ds:schemaRef ds:uri="http://schemas.microsoft.com/office/2006/metadata/contentType"/>
@@ -14670,6 +14651,14 @@
 </ds:datastoreItem>
 </file>
 
+<file path=customXml/itemProps2.xml><?xml version="1.0" encoding="utf-8"?>
+<ds:datastoreItem xmlns:ds="http://schemas.openxmlformats.org/officeDocument/2006/customXml" ds:itemID="{02C30E68-946A-4504-B925-FF5230B8A4C3}">
+  <ds:schemaRefs>
+    <ds:schemaRef ds:uri="http://schemas.microsoft.com/sharepoint/v3/contenttype/forms"/>
+  </ds:schemaRefs>
+</ds:datastoreItem>
+</file>
+
 <file path=customXml/itemProps3.xml><?xml version="1.0" encoding="utf-8"?>
 <ds:datastoreItem xmlns:ds="http://schemas.openxmlformats.org/officeDocument/2006/customXml" ds:itemID="{EDF12601-A8A7-4B7A-9481-1111248E774A}">
   <ds:schemaRefs>
@@ -14683,9 +14672,9 @@
 </file>
 
 <file path=customXml/itemProps4.xml><?xml version="1.0" encoding="utf-8"?>
-<ds:datastoreItem xmlns:ds="http://schemas.openxmlformats.org/officeDocument/2006/customXml" ds:itemID="{02C30E68-946A-4504-B925-FF5230B8A4C3}">
+<ds:datastoreItem xmlns:ds="http://schemas.openxmlformats.org/officeDocument/2006/customXml" ds:itemID="{41B34B53-803B-4600-951E-8C7B6ABDE6A5}">
   <ds:schemaRefs>
-    <ds:schemaRef ds:uri="http://schemas.microsoft.com/sharepoint/v3/contenttype/forms"/>
+    <ds:schemaRef ds:uri="http://schemas.openxmlformats.org/officeDocument/2006/bibliography"/>
   </ds:schemaRefs>
 </ds:datastoreItem>
 </file>
</xml_diff>

<commit_message>
V1.3 - significant improvement to back-end business logic and generation enhancements
</commit_message>
<xml_diff>
--- a/planet_it_vciso_template.docx
+++ b/planet_it_vciso_template.docx
@@ -1686,13 +1686,46 @@
       </w:r>
     </w:p>
     <w:p>
+      <w:r>
+        <w:t>{% for comp in compliance_alignment %} Standard: {{ comp.standard }} {% if comp.gaps %} Gaps: {% for gap in comp.gaps %}</w:t>
+      </w:r>
+    </w:p>
+    <w:p/>
+    <w:p>
+      <w:r>
+        <w:t>- {{ gap }} {% endfor %} {% endif %} {% if comp.fill_plan %} Remediation Plans: {% for gp in comp.fill_plan %}</w:t>
+      </w:r>
+    </w:p>
+    <w:p/>
+    <w:p>
+      <w:r>
+        <w:t>- Gap: {{ gp.gap_description }}</w:t>
+      </w:r>
+    </w:p>
+    <w:p/>
+    <w:p>
+      <w:r>
+        <w:t xml:space="preserve">  - Actions: {% for action in gp.recommended_actions %}</w:t>
+      </w:r>
+    </w:p>
+    <w:p>
+      <w:r>
+        <w:t xml:space="preserve">    - {{ action }} {% endfor %}</w:t>
+      </w:r>
+    </w:p>
+    <w:p>
+      <w:r>
+        <w:t xml:space="preserve">  - Owner: {{ gp.owner }}</w:t>
+      </w:r>
+    </w:p>
+    <w:p>
       <w:pPr>
         <w:rPr>
           <w:rStyle w:val="Heading2Char"/>
         </w:rPr>
       </w:pPr>
       <w:r>
-        <w:t>{{ compliance_alignment }}</w:t>
+        <w:t xml:space="preserve">  - Due By: {{ gp.due_by }} {% endfor %} {% endif %} {% endfor %}</w:t>
       </w:r>
     </w:p>
     <w:p>
@@ -1718,6 +1751,23 @@
         <w:t>{{ cost_of_inaction }}</w:t>
       </w:r>
     </w:p>
+    <w:p/>
+    <w:p>
+      <w:r>
+        <w:t>{</w:t>
+      </w:r>
+      <w:r>
+        <w:t>{ cost_of_inaction_summary }}</w:t>
+      </w:r>
+    </w:p>
+    <w:p/>
+    <w:p>
+      <w:r>
+        <w:t>{{ threat_intelligence_context }}</w:t>
+      </w:r>
+    </w:p>
+    <w:p/>
+    <w:p/>
     <w:p/>
     <w:p/>
     <w:p/>
@@ -4260,11 +4310,18 @@
         <w:pStyle w:val="ListParagraph"/>
         <w:numPr>
           <w:ilvl w:val="0"/>
-          <w:numId w:val="4"/>
+          <w:numId w:val="3"/>
         </w:numPr>
       </w:pPr>
       <w:r>
-        <w:t>Foundational Hygeine</w:t>
+        <w:rPr>
+          <w:b/>
+          <w:bCs/>
+        </w:rPr>
+        <w:t>Foundational Hygiene:</w:t>
+      </w:r>
+      <w:r>
+        <w:t xml:space="preserve"> Establishes the essential technical controls and baseline configuration practices required to eliminate common vulnerabilities and protect core corporate assets from opportunistic cyber threats.</w:t>
       </w:r>
     </w:p>
     <w:p>
@@ -4272,11 +4329,18 @@
         <w:pStyle w:val="ListParagraph"/>
         <w:numPr>
           <w:ilvl w:val="0"/>
-          <w:numId w:val="4"/>
+          <w:numId w:val="3"/>
         </w:numPr>
       </w:pPr>
       <w:r>
-        <w:t>Active Managed Defence</w:t>
+        <w:rPr>
+          <w:b/>
+          <w:bCs/>
+        </w:rPr>
+        <w:t>Active Managed Defence:</w:t>
+      </w:r>
+      <w:r>
+        <w:t xml:space="preserve"> Implements continuous security monitoring, real-time threat detection, and proactive incident response workflows to actively contest, isolate, and mitigate live attacks.</w:t>
       </w:r>
     </w:p>
     <w:p>
@@ -4284,11 +4348,18 @@
         <w:pStyle w:val="ListParagraph"/>
         <w:numPr>
           <w:ilvl w:val="0"/>
-          <w:numId w:val="4"/>
+          <w:numId w:val="3"/>
         </w:numPr>
       </w:pPr>
       <w:r>
-        <w:t>Adaptive Governance</w:t>
+        <w:rPr>
+          <w:b/>
+          <w:bCs/>
+        </w:rPr>
+        <w:t>Adaptive Governance:</w:t>
+      </w:r>
+      <w:r>
+        <w:t xml:space="preserve"> Integrates dynamic risk management, regulatory compliance, and continuous policy evolution to align security strategy with shifting business goals and the broader threat landscape.</w:t>
       </w:r>
     </w:p>
     <w:p/>
@@ -4450,6 +4521,7 @@
                 <w:b/>
                 <w:bCs/>
               </w:rPr>
+              <w:lastRenderedPageBreak/>
               <w:t>Phase 1: Foundational Hygiene</w:t>
             </w:r>
             <w:r>
@@ -4535,7 +4607,6 @@
                 <w:b/>
                 <w:bCs/>
               </w:rPr>
-              <w:lastRenderedPageBreak/>
               <w:t>Phase 2: Active Managed Defence</w:t>
             </w:r>
             <w:r>
@@ -4723,40 +4794,13 @@
     <w:p/>
     <w:p>
       <w:r>
-        <w:t>12-Month Success Metrics:</w:t>
-      </w:r>
-    </w:p>
-    <w:p>
-      <w:r>
-        <w:t>{% for metric in success_metrics %}• {{ metric }}</w:t>
-      </w:r>
-    </w:p>
-    <w:p>
-      <w:r>
-        <w:t>{% endfor %}</w:t>
-      </w:r>
-    </w:p>
-    <w:p/>
-    <w:p>
-      <w:r>
-        <w:t>Ongoing Engagement Cadence:</w:t>
-      </w:r>
-    </w:p>
-    <w:p>
-      <w:r>
-        <w:t>{% for cadence in engagement_cadence %}• {{ cadence }}</w:t>
-      </w:r>
-    </w:p>
-    <w:p>
-      <w:pPr>
-        <w:rPr>
-          <w:rStyle w:val="HTMLCode"/>
-          <w:rFonts w:ascii="Roboto" w:eastAsiaTheme="minorHAnsi" w:hAnsi="Roboto" w:cstheme="minorBidi"/>
-          <w:szCs w:val="24"/>
-        </w:rPr>
-      </w:pPr>
-      <w:r>
-        <w:t>{% endfor %}</w:t>
+        <w:t>{{</w:t>
+      </w:r>
+      <w:r>
+        <w:t xml:space="preserve"> partnership_details</w:t>
+      </w:r>
+      <w:r>
+        <w:t xml:space="preserve"> }}</w:t>
       </w:r>
     </w:p>
     <w:p>
@@ -12915,6 +12959,119 @@
       </w:pPr>
     </w:lvl>
   </w:abstractNum>
+  <w:abstractNum w:abstractNumId="4" w15:restartNumberingAfterBreak="0">
+    <w:nsid w:val="7AF31535"/>
+    <w:multiLevelType w:val="hybridMultilevel"/>
+    <w:tmpl w:val="A5FA0B4E"/>
+    <w:lvl w:ilvl="0" w:tplc="08090001">
+      <w:start w:val="1"/>
+      <w:numFmt w:val="bullet"/>
+      <w:lvlText w:val=""/>
+      <w:lvlJc w:val="left"/>
+      <w:pPr>
+        <w:ind w:left="720" w:hanging="360"/>
+      </w:pPr>
+      <w:rPr>
+        <w:rFonts w:ascii="Symbol" w:hAnsi="Symbol" w:hint="default"/>
+      </w:rPr>
+    </w:lvl>
+    <w:lvl w:ilvl="1" w:tplc="08090003" w:tentative="1">
+      <w:start w:val="1"/>
+      <w:numFmt w:val="bullet"/>
+      <w:lvlText w:val="o"/>
+      <w:lvlJc w:val="left"/>
+      <w:pPr>
+        <w:ind w:left="1440" w:hanging="360"/>
+      </w:pPr>
+      <w:rPr>
+        <w:rFonts w:ascii="Courier New" w:hAnsi="Courier New" w:cs="Courier New" w:hint="default"/>
+      </w:rPr>
+    </w:lvl>
+    <w:lvl w:ilvl="2" w:tplc="08090005" w:tentative="1">
+      <w:start w:val="1"/>
+      <w:numFmt w:val="bullet"/>
+      <w:lvlText w:val=""/>
+      <w:lvlJc w:val="left"/>
+      <w:pPr>
+        <w:ind w:left="2160" w:hanging="360"/>
+      </w:pPr>
+      <w:rPr>
+        <w:rFonts w:ascii="Wingdings" w:hAnsi="Wingdings" w:hint="default"/>
+      </w:rPr>
+    </w:lvl>
+    <w:lvl w:ilvl="3" w:tplc="08090001" w:tentative="1">
+      <w:start w:val="1"/>
+      <w:numFmt w:val="bullet"/>
+      <w:lvlText w:val=""/>
+      <w:lvlJc w:val="left"/>
+      <w:pPr>
+        <w:ind w:left="2880" w:hanging="360"/>
+      </w:pPr>
+      <w:rPr>
+        <w:rFonts w:ascii="Symbol" w:hAnsi="Symbol" w:hint="default"/>
+      </w:rPr>
+    </w:lvl>
+    <w:lvl w:ilvl="4" w:tplc="08090003" w:tentative="1">
+      <w:start w:val="1"/>
+      <w:numFmt w:val="bullet"/>
+      <w:lvlText w:val="o"/>
+      <w:lvlJc w:val="left"/>
+      <w:pPr>
+        <w:ind w:left="3600" w:hanging="360"/>
+      </w:pPr>
+      <w:rPr>
+        <w:rFonts w:ascii="Courier New" w:hAnsi="Courier New" w:cs="Courier New" w:hint="default"/>
+      </w:rPr>
+    </w:lvl>
+    <w:lvl w:ilvl="5" w:tplc="08090005" w:tentative="1">
+      <w:start w:val="1"/>
+      <w:numFmt w:val="bullet"/>
+      <w:lvlText w:val=""/>
+      <w:lvlJc w:val="left"/>
+      <w:pPr>
+        <w:ind w:left="4320" w:hanging="360"/>
+      </w:pPr>
+      <w:rPr>
+        <w:rFonts w:ascii="Wingdings" w:hAnsi="Wingdings" w:hint="default"/>
+      </w:rPr>
+    </w:lvl>
+    <w:lvl w:ilvl="6" w:tplc="08090001" w:tentative="1">
+      <w:start w:val="1"/>
+      <w:numFmt w:val="bullet"/>
+      <w:lvlText w:val=""/>
+      <w:lvlJc w:val="left"/>
+      <w:pPr>
+        <w:ind w:left="5040" w:hanging="360"/>
+      </w:pPr>
+      <w:rPr>
+        <w:rFonts w:ascii="Symbol" w:hAnsi="Symbol" w:hint="default"/>
+      </w:rPr>
+    </w:lvl>
+    <w:lvl w:ilvl="7" w:tplc="08090003" w:tentative="1">
+      <w:start w:val="1"/>
+      <w:numFmt w:val="bullet"/>
+      <w:lvlText w:val="o"/>
+      <w:lvlJc w:val="left"/>
+      <w:pPr>
+        <w:ind w:left="5760" w:hanging="360"/>
+      </w:pPr>
+      <w:rPr>
+        <w:rFonts w:ascii="Courier New" w:hAnsi="Courier New" w:cs="Courier New" w:hint="default"/>
+      </w:rPr>
+    </w:lvl>
+    <w:lvl w:ilvl="8" w:tplc="08090005" w:tentative="1">
+      <w:start w:val="1"/>
+      <w:numFmt w:val="bullet"/>
+      <w:lvlText w:val=""/>
+      <w:lvlJc w:val="left"/>
+      <w:pPr>
+        <w:ind w:left="6480" w:hanging="360"/>
+      </w:pPr>
+      <w:rPr>
+        <w:rFonts w:ascii="Wingdings" w:hAnsi="Wingdings" w:hint="default"/>
+      </w:rPr>
+    </w:lvl>
+  </w:abstractNum>
   <w:num w:numId="1" w16cid:durableId="760874054">
     <w:abstractNumId w:val="2"/>
   </w:num>
@@ -12926,6 +13083,9 @@
   </w:num>
   <w:num w:numId="4" w16cid:durableId="918055279">
     <w:abstractNumId w:val="0"/>
+  </w:num>
+  <w:num w:numId="5" w16cid:durableId="31922767">
+    <w:abstractNumId w:val="4"/>
   </w:num>
   <w:numIdMacAtCleanup w:val="4"/>
 </w:numbering>
@@ -14321,6 +14481,50 @@
 </file>
 
 <file path=customXml/item1.xml><?xml version="1.0" encoding="utf-8"?>
+<b:Sources xmlns:b="http://schemas.openxmlformats.org/officeDocument/2006/bibliography" xmlns="http://schemas.openxmlformats.org/officeDocument/2006/bibliography" SelectedStyle="\APASixthEditionOfficeOnline.xsl" StyleName="APA" Version="6"/>
+</file>
+
+<file path=customXml/item2.xml><?xml version="1.0" encoding="utf-8"?>
+<p:properties xmlns:p="http://schemas.microsoft.com/office/2006/metadata/properties" xmlns:xsi="http://www.w3.org/2001/XMLSchema-instance" xmlns:pc="http://schemas.microsoft.com/office/infopath/2007/PartnerControls">
+  <documentManagement>
+    <_ip_UnifiedCompliancePolicyUIAction xmlns="http://schemas.microsoft.com/sharepoint/v3" xsi:nil="true"/>
+    <_ip_UnifiedCompliancePolicyProperties xmlns="http://schemas.microsoft.com/sharepoint/v3" xsi:nil="true"/>
+    <lcf76f155ced4ddcb4097134ff3c332f xmlns="bc555557-3e8b-4e67-83dc-4a843c87bf48">
+      <Terms xmlns="http://schemas.microsoft.com/office/infopath/2007/PartnerControls"/>
+    </lcf76f155ced4ddcb4097134ff3c332f>
+    <TaxCatchAll xmlns="13e5e634-19bb-4da3-8eb1-d732f895062a" xsi:nil="true"/>
+    <SharedWithUsers xmlns="13e5e634-19bb-4da3-8eb1-d732f895062a">
+      <UserInfo>
+        <DisplayName>James Dell</DisplayName>
+        <AccountId>10</AccountId>
+        <AccountType/>
+      </UserInfo>
+      <UserInfo>
+        <DisplayName>Luke Finch</DisplayName>
+        <AccountId>44</AccountId>
+        <AccountType/>
+      </UserInfo>
+      <UserInfo>
+        <DisplayName>Sam Wray</DisplayName>
+        <AccountId>39</AccountId>
+        <AccountType/>
+      </UserInfo>
+      <UserInfo>
+        <DisplayName>Nick Johns</DisplayName>
+        <AccountId>18</AccountId>
+        <AccountType/>
+      </UserInfo>
+      <UserInfo>
+        <DisplayName>Justin Towle</DisplayName>
+        <AccountId>70</AccountId>
+        <AccountType/>
+      </UserInfo>
+    </SharedWithUsers>
+  </documentManagement>
+</p:properties>
+</file>
+
+<file path=customXml/item3.xml><?xml version="1.0" encoding="utf-8"?>
 <ct:contentTypeSchema xmlns:ct="http://schemas.microsoft.com/office/2006/metadata/contentType" xmlns:ma="http://schemas.microsoft.com/office/2006/metadata/properties/metaAttributes" ct:_="" ma:_="" ma:contentTypeName="Document" ma:contentTypeID="0x01010035785702D987474A98E5EB52BEDD3AA6" ma:contentTypeVersion="19" ma:contentTypeDescription="Create a new document." ma:contentTypeScope="" ma:versionID="7475e8a14b23e3b44613142ca3702c71">
   <xsd:schema xmlns:xsd="http://www.w3.org/2001/XMLSchema" xmlns:xs="http://www.w3.org/2001/XMLSchema" xmlns:p="http://schemas.microsoft.com/office/2006/metadata/properties" xmlns:ns1="http://schemas.microsoft.com/sharepoint/v3" xmlns:ns2="bc555557-3e8b-4e67-83dc-4a843c87bf48" xmlns:ns3="13e5e634-19bb-4da3-8eb1-d732f895062a" targetNamespace="http://schemas.microsoft.com/office/2006/metadata/properties" ma:root="true" ma:fieldsID="a0e591cb8f16aef1e2d445ad70521c76" ns1:_="" ns2:_="" ns3:_="">
     <xsd:import namespace="http://schemas.microsoft.com/sharepoint/v3"/>
@@ -14578,7 +14782,7 @@
 </ct:contentTypeSchema>
 </file>
 
-<file path=customXml/item2.xml><?xml version="1.0" encoding="utf-8"?>
+<file path=customXml/item4.xml><?xml version="1.0" encoding="utf-8"?>
 <?mso-contentType ?>
 <FormTemplates xmlns="http://schemas.microsoft.com/sharepoint/v3/contenttype/forms">
   <Display>DocumentLibraryForm</Display>
@@ -14587,51 +14791,27 @@
 </FormTemplates>
 </file>
 
-<file path=customXml/item3.xml><?xml version="1.0" encoding="utf-8"?>
-<p:properties xmlns:p="http://schemas.microsoft.com/office/2006/metadata/properties" xmlns:xsi="http://www.w3.org/2001/XMLSchema-instance" xmlns:pc="http://schemas.microsoft.com/office/infopath/2007/PartnerControls">
-  <documentManagement>
-    <_ip_UnifiedCompliancePolicyUIAction xmlns="http://schemas.microsoft.com/sharepoint/v3" xsi:nil="true"/>
-    <_ip_UnifiedCompliancePolicyProperties xmlns="http://schemas.microsoft.com/sharepoint/v3" xsi:nil="true"/>
-    <lcf76f155ced4ddcb4097134ff3c332f xmlns="bc555557-3e8b-4e67-83dc-4a843c87bf48">
-      <Terms xmlns="http://schemas.microsoft.com/office/infopath/2007/PartnerControls"/>
-    </lcf76f155ced4ddcb4097134ff3c332f>
-    <TaxCatchAll xmlns="13e5e634-19bb-4da3-8eb1-d732f895062a" xsi:nil="true"/>
-    <SharedWithUsers xmlns="13e5e634-19bb-4da3-8eb1-d732f895062a">
-      <UserInfo>
-        <DisplayName>James Dell</DisplayName>
-        <AccountId>10</AccountId>
-        <AccountType/>
-      </UserInfo>
-      <UserInfo>
-        <DisplayName>Luke Finch</DisplayName>
-        <AccountId>44</AccountId>
-        <AccountType/>
-      </UserInfo>
-      <UserInfo>
-        <DisplayName>Sam Wray</DisplayName>
-        <AccountId>39</AccountId>
-        <AccountType/>
-      </UserInfo>
-      <UserInfo>
-        <DisplayName>Nick Johns</DisplayName>
-        <AccountId>18</AccountId>
-        <AccountType/>
-      </UserInfo>
-      <UserInfo>
-        <DisplayName>Justin Towle</DisplayName>
-        <AccountId>70</AccountId>
-        <AccountType/>
-      </UserInfo>
-    </SharedWithUsers>
-  </documentManagement>
-</p:properties>
+<file path=customXml/itemProps1.xml><?xml version="1.0" encoding="utf-8"?>
+<ds:datastoreItem xmlns:ds="http://schemas.openxmlformats.org/officeDocument/2006/customXml" ds:itemID="{41B34B53-803B-4600-951E-8C7B6ABDE6A5}">
+  <ds:schemaRefs>
+    <ds:schemaRef ds:uri="http://schemas.openxmlformats.org/officeDocument/2006/bibliography"/>
+  </ds:schemaRefs>
+</ds:datastoreItem>
 </file>
 
-<file path=customXml/item4.xml><?xml version="1.0" encoding="utf-8"?>
-<b:Sources xmlns:b="http://schemas.openxmlformats.org/officeDocument/2006/bibliography" xmlns="http://schemas.openxmlformats.org/officeDocument/2006/bibliography" SelectedStyle="\APASixthEditionOfficeOnline.xsl" StyleName="APA" Version="6"/>
+<file path=customXml/itemProps2.xml><?xml version="1.0" encoding="utf-8"?>
+<ds:datastoreItem xmlns:ds="http://schemas.openxmlformats.org/officeDocument/2006/customXml" ds:itemID="{EDF12601-A8A7-4B7A-9481-1111248E774A}">
+  <ds:schemaRefs>
+    <ds:schemaRef ds:uri="http://schemas.microsoft.com/office/2006/metadata/properties"/>
+    <ds:schemaRef ds:uri="http://schemas.microsoft.com/office/infopath/2007/PartnerControls"/>
+    <ds:schemaRef ds:uri="http://schemas.microsoft.com/sharepoint/v3"/>
+    <ds:schemaRef ds:uri="bc555557-3e8b-4e67-83dc-4a843c87bf48"/>
+    <ds:schemaRef ds:uri="13e5e634-19bb-4da3-8eb1-d732f895062a"/>
+  </ds:schemaRefs>
+</ds:datastoreItem>
 </file>
 
-<file path=customXml/itemProps1.xml><?xml version="1.0" encoding="utf-8"?>
+<file path=customXml/itemProps3.xml><?xml version="1.0" encoding="utf-8"?>
 <ds:datastoreItem xmlns:ds="http://schemas.openxmlformats.org/officeDocument/2006/customXml" ds:itemID="{7F9D1B01-7FEE-4553-9877-3B31209422E5}">
   <ds:schemaRefs>
     <ds:schemaRef ds:uri="http://schemas.microsoft.com/office/2006/metadata/contentType"/>
@@ -14651,30 +14831,10 @@
 </ds:datastoreItem>
 </file>
 
-<file path=customXml/itemProps2.xml><?xml version="1.0" encoding="utf-8"?>
+<file path=customXml/itemProps4.xml><?xml version="1.0" encoding="utf-8"?>
 <ds:datastoreItem xmlns:ds="http://schemas.openxmlformats.org/officeDocument/2006/customXml" ds:itemID="{02C30E68-946A-4504-B925-FF5230B8A4C3}">
   <ds:schemaRefs>
     <ds:schemaRef ds:uri="http://schemas.microsoft.com/sharepoint/v3/contenttype/forms"/>
   </ds:schemaRefs>
 </ds:datastoreItem>
-</file>
-
-<file path=customXml/itemProps3.xml><?xml version="1.0" encoding="utf-8"?>
-<ds:datastoreItem xmlns:ds="http://schemas.openxmlformats.org/officeDocument/2006/customXml" ds:itemID="{EDF12601-A8A7-4B7A-9481-1111248E774A}">
-  <ds:schemaRefs>
-    <ds:schemaRef ds:uri="http://schemas.microsoft.com/office/2006/metadata/properties"/>
-    <ds:schemaRef ds:uri="http://schemas.microsoft.com/office/infopath/2007/PartnerControls"/>
-    <ds:schemaRef ds:uri="http://schemas.microsoft.com/sharepoint/v3"/>
-    <ds:schemaRef ds:uri="bc555557-3e8b-4e67-83dc-4a843c87bf48"/>
-    <ds:schemaRef ds:uri="13e5e634-19bb-4da3-8eb1-d732f895062a"/>
-  </ds:schemaRefs>
-</ds:datastoreItem>
-</file>
-
-<file path=customXml/itemProps4.xml><?xml version="1.0" encoding="utf-8"?>
-<ds:datastoreItem xmlns:ds="http://schemas.openxmlformats.org/officeDocument/2006/customXml" ds:itemID="{41B34B53-803B-4600-951E-8C7B6ABDE6A5}">
-  <ds:schemaRefs>
-    <ds:schemaRef ds:uri="http://schemas.openxmlformats.org/officeDocument/2006/bibliography"/>
-  </ds:schemaRefs>
-</ds:datastoreItem>
 </file>
</xml_diff>